<commit_message>
Triaža: izpiši, kdaj izbira ne sledi več ocenam
Kljukice "Izračunaj podrobno" so ob prvem ročnem dotiku prenehale slediti
ocenam. Zamrznitev je namerna — ocene ne smejo povoziti ročne izbire — a je
bila nevidna: obiskovalec je področje ocenil najvišje, kljukica se ni
premaknila in videti je bilo kot okvara. Stanje je zdaj izpisano (role="status",
ker se stavek zamenja natanko ob tej spremembi vedenja) in ročno izbiro je
mogoče zavreči z gumbom "Vrni samodejni predlog".

Zraven gradivo prodajne priprave: poročilo o optimizaciji in pripomoček
priprava-na-pogovor.html ter posodobljena dokumentacija postopka izračuna.

Co-Authored-By: Claude Opus 5 <noreply@anthropic.com>
</commit_message>
<xml_diff>
--- a/report/delovanje aplikacije/izračun/postopek izračuna/izračun.docx
+++ b/report/delovanje aplikacije/izračun/postopek izračuna/izračun.docx
@@ -1,6 +1,6 @@
 
 <file path=word/document.xml><?xml version="1.0" encoding="utf-8"?>
-<w:document xmlns:wpc="http://schemas.microsoft.com/office/word/2010/wordprocessingCanvas" xmlns:mc="http://schemas.openxmlformats.org/markup-compatibility/2006" xmlns:o="urn:schemas-microsoft-com:office:office" xmlns:r="http://schemas.openxmlformats.org/officeDocument/2006/relationships" xmlns:m="http://schemas.openxmlformats.org/officeDocument/2006/math" xmlns:v="urn:schemas-microsoft-com:vml" xmlns:wp14="http://schemas.microsoft.com/office/word/2010/wordprocessingDrawing" xmlns:wp="http://schemas.openxmlformats.org/drawingml/2006/wordprocessingDrawing" xmlns:w10="urn:schemas-microsoft-com:office:word" xmlns:w="http://schemas.openxmlformats.org/wordprocessingml/2006/main" xmlns:w14="http://schemas.microsoft.com/office/word/2010/wordml" xmlns:w15="http://schemas.microsoft.com/office/word/2012/wordml" xmlns:wpg="http://schemas.microsoft.com/office/word/2010/wordprocessingGroup" xmlns:wpi="http://schemas.microsoft.com/office/word/2010/wordprocessingInk" xmlns:wne="http://schemas.microsoft.com/office/word/2006/wordml" xmlns:wps="http://schemas.microsoft.com/office/word/2010/wordprocessingShape" xmlns:cx="http://schemas.microsoft.com/office/drawing/2014/chartex" xmlns:cx1="http://schemas.microsoft.com/office/drawing/2015/9/8/chartex" xmlns:cx2="http://schemas.microsoft.com/office/drawing/2015/10/21/chartex" xmlns:cx3="http://schemas.microsoft.com/office/drawing/2016/5/9/chartex" xmlns:cx4="http://schemas.microsoft.com/office/drawing/2016/5/10/chartex" xmlns:cx5="http://schemas.microsoft.com/office/drawing/2016/5/11/chartex" xmlns:cx6="http://schemas.microsoft.com/office/drawing/2016/5/12/chartex" xmlns:cx7="http://schemas.microsoft.com/office/drawing/2016/5/13/chartex" xmlns:cx8="http://schemas.microsoft.com/office/drawing/2016/5/14/chartex" xmlns:aink="http://schemas.microsoft.com/office/drawing/2016/ink" xmlns:am3d="http://schemas.microsoft.com/office/drawing/2017/model3d" xmlns:w16cex="http://schemas.microsoft.com/office/word/2018/wordml/cex" xmlns:w16cid="http://schemas.microsoft.com/office/word/2016/wordml/cid" xmlns:w16="http://schemas.microsoft.com/office/word/2018/wordml" xmlns:w16sdtdh="http://schemas.microsoft.com/office/word/2020/wordml/sdtdatahash" xmlns:w16se="http://schemas.microsoft.com/office/word/2015/wordml/symex" mc:Ignorable="w14 w15 wp14">
+<w:document xmlns:mc="http://schemas.openxmlformats.org/markup-compatibility/2006" xmlns:r="http://schemas.openxmlformats.org/officeDocument/2006/relationships" xmlns:w="http://schemas.openxmlformats.org/wordprocessingml/2006/main" xmlns:w14="http://schemas.microsoft.com/office/word/2010/wordml" xmlns:w15="http://schemas.microsoft.com/office/word/2012/wordml" xmlns:wp14="http://schemas.microsoft.com/office/word/2010/wordprocessingDrawing" mc:Ignorable="w14 w15 wp14">
   <w:body>
     <w:p>
       <w:pPr>
@@ -263,7 +263,7 @@
           <w:sz w:val="18"/>
           <w:szCs w:val="18"/>
         </w:rPr>
-        <w:t xml:space="preserve">Vse številke v primerih so ilustrativne in izhajajo iz istega vzorčnega proizvodnega podjetja.</w:t>
+        <w:t xml:space="preserve">Številke vzorčnega primera (poglavja 6, 7, 8 in 10) so ilustrativne in izhajajo iz istega proizvodnega podjetja. Razdelka 4.7 in 4.8 dodatno prikazujeta formule drugih panog z lastnimi številkami — te v vzorčni proizvodni primer ne vstopajo.</w:t>
       </w:r>
     </w:p>
     <w:p>
@@ -2057,7 +2057,7 @@
             <w:sz w:val="20"/>
             <w:szCs w:val="20"/>
           </w:rPr>
-          <w:t xml:space="preserve">6.9 Znana posebnost splošnega vprašalnika</w:t>
+          <w:t xml:space="preserve">6.9 Enotna razvrstitev v vseh panogah</w:t>
         </w:r>
       </w:hyperlink>
       <w:r>
@@ -2486,7 +2486,7 @@
             <w:sz w:val="21"/>
             <w:szCs w:val="21"/>
           </w:rPr>
-          <w:t xml:space="preserve">8. Korak 7: Pas izboljšave</w:t>
+          <w:t xml:space="preserve">8. Korak 7: Naslovljivi potencial</w:t>
         </w:r>
       </w:hyperlink>
       <w:r>
@@ -2564,7 +2564,7 @@
             <w:sz w:val="20"/>
             <w:szCs w:val="20"/>
           </w:rPr>
-          <w:t xml:space="preserve">8.2 Pasovi glede na trenutni sistem</w:t>
+          <w:t xml:space="preserve">8.2 Vrzel sedanjega sistema</w:t>
         </w:r>
       </w:hyperlink>
       <w:r>
@@ -2603,7 +2603,7 @@
             <w:sz w:val="20"/>
             <w:szCs w:val="20"/>
           </w:rPr>
-          <w:t xml:space="preserve">8.3 Pas se uporabi na naslovljivem delu, ne na celotni izgubi</w:t>
+          <w:t xml:space="preserve">8.3 Zgornja meja pri fizikalnem dnu</w:t>
         </w:r>
       </w:hyperlink>
       <w:r>
@@ -2642,7 +2642,7 @@
             <w:sz w:val="20"/>
             <w:szCs w:val="20"/>
           </w:rPr>
-          <w:t xml:space="preserve">8.4 Kombinirani učinek obeh odstotkov</w:t>
+          <w:t xml:space="preserve">8.4 Naslovljivi potencial po vzrokih</w:t>
         </w:r>
       </w:hyperlink>
       <w:r>
@@ -2681,7 +2681,7 @@
             <w:sz w:val="20"/>
             <w:szCs w:val="20"/>
           </w:rPr>
-          <w:t xml:space="preserve">8.5 Ista naslovljiva izguba, različni sistemi</w:t>
+          <w:t xml:space="preserve">8.5 Večletni pogled in cena odlašanja</w:t>
         </w:r>
       </w:hyperlink>
       <w:r>
@@ -2759,7 +2759,7 @@
             <w:sz w:val="20"/>
             <w:szCs w:val="20"/>
           </w:rPr>
-          <w:t xml:space="preserve">8.7 Česa pas izboljšave ni</w:t>
+          <w:t xml:space="preserve">8.7 Česa naslovljivi potencial ni</w:t>
         </w:r>
       </w:hyperlink>
       <w:r>
@@ -3344,7 +3344,7 @@
             <w:sz w:val="20"/>
             <w:szCs w:val="20"/>
           </w:rPr>
-          <w:t xml:space="preserve">10.5 Korak 7: pas izboljšave</w:t>
+          <w:t xml:space="preserve">10.5 Korak 7: naslovljivi potencial</w:t>
         </w:r>
       </w:hyperlink>
       <w:r>
@@ -4446,7 +4446,7 @@
                 <w:sz w:val="19"/>
                 <w:szCs w:val="19"/>
               </w:rPr>
-              <w:t xml:space="preserve">Pas izboljšave</w:t>
+              <w:t xml:space="preserve">Naslovljivi potencial</w:t>
             </w:r>
           </w:p>
         </w:tc>
@@ -4475,7 +4475,7 @@
                 <w:sz w:val="19"/>
                 <w:szCs w:val="19"/>
               </w:rPr>
-              <w:t xml:space="preserve">Oceni, kolikšen del tega dela bi bilo mogoče realno zmanjšati.</w:t>
+              <w:t xml:space="preserve">Sešteje naslovljive dele v znesek, na katerega sistem lahko vpliva.</w:t>
             </w:r>
           </w:p>
         </w:tc>
@@ -5161,7 +5161,7 @@
                 <w:sz w:val="21"/>
                 <w:szCs w:val="21"/>
               </w:rPr>
-              <w:t xml:space="preserve">7  PAS IZBOLJŠAVE   </w:t>
+              <w:t xml:space="preserve">7  NASLOVLJIVI POTENCIAL   </w:t>
             </w:r>
             <w:r>
               <w:rPr>
@@ -5169,7 +5169,7 @@
                 <w:sz w:val="20"/>
                 <w:szCs w:val="20"/>
               </w:rPr>
-              <w:t xml:space="preserve">× razpon glede na trenutni sistem (8–40 %)</w:t>
+              <w:t xml:space="preserve">seštevek naslovljivih delov; drugega množitelja ni</w:t>
             </w:r>
           </w:p>
         </w:tc>
@@ -5545,7 +5545,7 @@
                 <w:sz w:val="19"/>
                 <w:szCs w:val="19"/>
               </w:rPr>
-              <w:t xml:space="preserve">Naslovljiva osnova</w:t>
+              <w:t xml:space="preserve">Naslovljivi potencial</w:t>
             </w:r>
           </w:p>
         </w:tc>
@@ -5574,7 +5574,7 @@
                 <w:sz w:val="19"/>
                 <w:szCs w:val="19"/>
               </w:rPr>
-              <w:t xml:space="preserve">Kolikšen del tega je povezan z vzroki, na katere poslovni sistem sploh lahko vpliva.</w:t>
+              <w:t xml:space="preserve">Kolikšen del tega je povezan z vzroki, na katere poslovni sistem lahko vpliva. To je hkrati končni prikazani potencial.</w:t>
             </w:r>
           </w:p>
         </w:tc>
@@ -5603,7 +5603,7 @@
                 <w:sz w:val="19"/>
                 <w:szCs w:val="19"/>
               </w:rPr>
-              <w:t xml:space="preserve">20.343 € letno</w:t>
+              <w:t xml:space="preserve">18.068 € letno</w:t>
             </w:r>
           </w:p>
         </w:tc>
@@ -5637,7 +5637,7 @@
                 <w:sz w:val="19"/>
                 <w:szCs w:val="19"/>
               </w:rPr>
-              <w:t xml:space="preserve">Realistični potencial izboljšave</w:t>
+              <w:t xml:space="preserve">Vrednost v treh letih</w:t>
             </w:r>
           </w:p>
         </w:tc>
@@ -5666,7 +5666,7 @@
                 <w:sz w:val="19"/>
                 <w:szCs w:val="19"/>
               </w:rPr>
-              <w:t xml:space="preserve">Kolikšen del naslovljive osnove bi bilo po oceni mogoče dejansko zmanjšati.</w:t>
+              <w:t xml:space="preserve">Skupni letni učinek čez obzorje, na katerem se odloča o poslovnem sistemu. Pozor: trileten znesek se računa iz skupnega letnega učinka, ne iz naslovljivega potenciala.</w:t>
             </w:r>
           </w:p>
         </w:tc>
@@ -5695,7 +5695,7 @@
                 <w:sz w:val="19"/>
                 <w:szCs w:val="19"/>
               </w:rPr>
-              <w:t xml:space="preserve">5.086–8.137 € letno</w:t>
+              <w:t xml:space="preserve">93.300 € v treh letih</w:t>
             </w:r>
           </w:p>
         </w:tc>
@@ -5772,7 +5772,7 @@
                 <w:sz w:val="21"/>
                 <w:szCs w:val="21"/>
               </w:rPr>
-              <w:t xml:space="preserve">Zaporedje je vedno enako: </w:t>
+              <w:t xml:space="preserve">Skupni letni učinek je izhodišče DVEH LOČENIH izpeljank: naslovljivega potenciala (× naslovljivi delež) in večletnega pogleda (× 3 leta). Ena ni nadaljevanje druge</w:t>
             </w:r>
             <w:r>
               <w:rPr>
@@ -5784,7 +5784,7 @@
                 <w:sz w:val="21"/>
                 <w:szCs w:val="21"/>
               </w:rPr>
-              <w:t xml:space="preserve">celotna izguba → naslovljivi del → realistični potencial</w:t>
+              <w:t xml:space="preserve"/>
             </w:r>
             <w:r>
               <w:rPr>
@@ -5822,7 +5822,7 @@
                 <w:sz w:val="21"/>
                 <w:szCs w:val="21"/>
               </w:rPr>
-              <w:t xml:space="preserve">Za primer z 10.000 € letne izgube, vzrokom »slabi podatki« (75 %) in poslovanjem v Excelu (25–40 %):</w:t>
+              <w:t xml:space="preserve">Za primer z 10.000 € letne izgube in glavnim vzrokom »slabi podatki« (75 %):</w:t>
             </w:r>
           </w:p>
           <w:p>
@@ -5840,7 +5840,7 @@
                 <w:sz w:val="21"/>
                 <w:szCs w:val="21"/>
               </w:rPr>
-              <w:t xml:space="preserve">10.000 €  →  7.500 €  →  1.875–3.000 €</w:t>
+              <w:t xml:space="preserve">10.000 € letno  →  naslovljivo 7.500 € letno        |        10.000 € × 3  =  30.000 € v treh letih</w:t>
             </w:r>
           </w:p>
         </w:tc>
@@ -6679,7 +6679,7 @@
                 <w:sz w:val="19"/>
                 <w:szCs w:val="19"/>
               </w:rPr>
-              <w:t xml:space="preserve">Določi pas izboljšave in tehnična opozorila.</w:t>
+              <w:t xml:space="preserve">Določi vrzel sedanjega sistema in tehnična opozorila.</w:t>
             </w:r>
           </w:p>
         </w:tc>
@@ -8445,7 +8445,7 @@
                 <w:sz w:val="19"/>
                 <w:szCs w:val="19"/>
               </w:rPr>
-              <w:t xml:space="preserve">Formule, vezane na obseg poslovanja.</w:t>
+              <w:t xml:space="preserve">Formule, vezane na obseg poslovanja. V proizvodnji tega podatka ne uporabi noben modul.</w:t>
             </w:r>
           </w:p>
         </w:tc>
@@ -8537,7 +8537,7 @@
                 <w:sz w:val="19"/>
                 <w:szCs w:val="19"/>
               </w:rPr>
-              <w:t xml:space="preserve">Pretvorba izgubljene prodaje v nezasluženo maržo.</w:t>
+              <w:t xml:space="preserve">Pretvorba izgubljene prodaje v nezasluženo maržo. V proizvodnji tega podatka ne uporabi noben modul.</w:t>
             </w:r>
           </w:p>
         </w:tc>
@@ -8566,7 +8566,7 @@
                 <w:sz w:val="19"/>
                 <w:szCs w:val="19"/>
               </w:rPr>
-              <w:t xml:space="preserve">25 %</w:t>
+              <w:t xml:space="preserve">26 %</w:t>
             </w:r>
           </w:p>
         </w:tc>
@@ -8629,7 +8629,7 @@
                 <w:sz w:val="19"/>
                 <w:szCs w:val="19"/>
               </w:rPr>
-              <w:t xml:space="preserve">Letni strošek denarja, vezanega v zalogah ali terjatvah.</w:t>
+              <w:t xml:space="preserve">Letni strošek denarja, vezanega v zalogah ali terjatvah. V proizvodnji se to vprašanje sploh ne zastavi in ga ne uporabi noben modul — vprašajo ga maloprodaja, veleprodaja in splošni vprašalnik.</w:t>
             </w:r>
           </w:p>
         </w:tc>
@@ -8658,7 +8658,7 @@
                 <w:sz w:val="19"/>
                 <w:szCs w:val="19"/>
               </w:rPr>
-              <w:t xml:space="preserve">6 %</w:t>
+              <w:t xml:space="preserve">— (sistemski privzetek 8,5 %)</w:t>
             </w:r>
           </w:p>
         </w:tc>
@@ -9775,7 +9775,7 @@
                 <w:sz w:val="19"/>
                 <w:szCs w:val="19"/>
               </w:rPr>
-              <w:t xml:space="preserve">Neusklajeni roki in slaba preglednost.</w:t>
+              <w:t xml:space="preserve">Neusklajeni roki, slaba preglednost, nejasne odgovornosti.</w:t>
             </w:r>
           </w:p>
         </w:tc>
@@ -9867,7 +9867,7 @@
                 <w:sz w:val="19"/>
                 <w:szCs w:val="19"/>
               </w:rPr>
-              <w:t xml:space="preserve">Odgovornosti, disciplina, organizacija dela.</w:t>
+              <w:t xml:space="preserve">Usposobljenost, disciplina, kadrovska kapaciteta.</w:t>
             </w:r>
           </w:p>
         </w:tc>
@@ -9988,7 +9988,7 @@
                 <w:sz w:val="19"/>
                 <w:szCs w:val="19"/>
               </w:rPr>
-              <w:t xml:space="preserve">30 %</w:t>
+              <w:t xml:space="preserve">45 %</w:t>
             </w:r>
           </w:p>
         </w:tc>
@@ -10080,7 +10080,7 @@
                 <w:sz w:val="19"/>
                 <w:szCs w:val="19"/>
               </w:rPr>
-              <w:t xml:space="preserve">25 %</w:t>
+              <w:t xml:space="preserve">30 %</w:t>
             </w:r>
           </w:p>
         </w:tc>
@@ -11137,7 +11137,7 @@
                 <w:sz w:val="19"/>
                 <w:szCs w:val="19"/>
               </w:rPr>
-              <w:t xml:space="preserve">Pri določenih formulah</w:t>
+              <w:t xml:space="preserve">Praviloma ne</w:t>
             </w:r>
           </w:p>
         </w:tc>
@@ -11887,7 +11887,7 @@
                 <w:sz w:val="19"/>
                 <w:szCs w:val="19"/>
               </w:rPr>
-              <w:t xml:space="preserve">Pri zalogah in terjatvah</w:t>
+              <w:t xml:space="preserve">Pri zalogah in terjatvah (ne v proizvodnji)</w:t>
             </w:r>
           </w:p>
         </w:tc>
@@ -12574,7 +12574,7 @@
                 <w:sz w:val="19"/>
                 <w:szCs w:val="19"/>
               </w:rPr>
-              <w:t xml:space="preserve">Da</w:t>
+              <w:t xml:space="preserve">Ne — samo prodajni signal</w:t>
             </w:r>
           </w:p>
         </w:tc>
@@ -13967,7 +13967,7 @@
                 <w:sz w:val="19"/>
                 <w:szCs w:val="19"/>
               </w:rPr>
-              <w:t xml:space="preserve">»Ne poznam postavke«</w:t>
+              <w:t xml:space="preserve">»Ne veste?« → »Vzemi povprečje panoge«</w:t>
             </w:r>
           </w:p>
         </w:tc>
@@ -14480,7 +14480,7 @@
                 <w:sz w:val="19"/>
                 <w:szCs w:val="19"/>
               </w:rPr>
-              <w:t xml:space="preserve">0,30 (neznan vzrok)</w:t>
+              <w:t xml:space="preserve">0,45 (neznan vzrok)</w:t>
             </w:r>
           </w:p>
         </w:tc>
@@ -14601,7 +14601,7 @@
                 <w:sz w:val="19"/>
                 <w:szCs w:val="19"/>
               </w:rPr>
-              <w:t xml:space="preserve">0,05 (najnižji delež)</w:t>
+              <w:t xml:space="preserve">0,10</w:t>
             </w:r>
           </w:p>
         </w:tc>
@@ -14892,7 +14892,7 @@
                 <w:sz w:val="19"/>
                 <w:szCs w:val="19"/>
               </w:rPr>
-              <w:t xml:space="preserve">Obravnava se kot konkretna ničla oziroma neizmerjen učinek.</w:t>
+              <w:t xml:space="preserve">Šteje kot neizpolnjeno polje — deleža izpolnjenosti ne poveča. Za razliko od »Ne vem« pa najvišje zanesljivosti ne prepreči.</w:t>
             </w:r>
           </w:p>
         </w:tc>
@@ -15530,7 +15530,7 @@
                 <w:sz w:val="21"/>
                 <w:szCs w:val="21"/>
               </w:rPr>
-              <w:t xml:space="preserve">Zato se postavka izpusti (0 €), zanesljivost pa se zniža na nizko, ker manjka podatek, ki ga formula nujno potrebuje.</w:t>
+              <w:t xml:space="preserve">Zato se postavka izpusti (0 €). Zanesljivost se zniža na nizko samo takrat, kadar prihodek res množi katero od izpolnjenih področij — v proizvodnji tega ne stori noben modul, zato manjkajoč prihodek proizvodnega rezultata ne zniža.</w:t>
             </w:r>
           </w:p>
         </w:tc>
@@ -16609,7 +16609,7 @@
                 <w:sz w:val="19"/>
                 <w:szCs w:val="19"/>
               </w:rPr>
-              <w:t xml:space="preserve">0,25</w:t>
+              <w:t xml:space="preserve">—</w:t>
             </w:r>
           </w:p>
         </w:tc>
@@ -16638,7 +16638,7 @@
                 <w:sz w:val="19"/>
                 <w:szCs w:val="19"/>
               </w:rPr>
-              <w:t xml:space="preserve">0,40</w:t>
+              <w:t xml:space="preserve">—</w:t>
             </w:r>
           </w:p>
         </w:tc>
@@ -16667,7 +16667,7 @@
                 <w:sz w:val="19"/>
                 <w:szCs w:val="19"/>
               </w:rPr>
-              <w:t xml:space="preserve">Izpeljano iz sistema</w:t>
+              <w:t xml:space="preserve">Ne normalizira se — prodajni signal, v izračun ne vstopa</w:t>
             </w:r>
           </w:p>
         </w:tc>
@@ -16740,7 +16740,7 @@
                 <w:sz w:val="21"/>
                 <w:szCs w:val="21"/>
               </w:rPr>
-              <w:t xml:space="preserve">Normalizacija ne izračuna nobene izgube. Zagotovi samo, da ima vsako polje veljavno računsko vrednost in da aplikacija ves čas ve, ali je ta vrednost izmerjena, ocenjena ali neznana.</w:t>
+              <w:t xml:space="preserve">Normalizacija ne izračuna nobene izgube. Zagotovi samo, da ima vsako polje veljavno računsko vrednost in da aplikacija ves čas ve, ali je ta vrednost izmerjena, ocenjena ali neznana. Opomba: zgornja tabela prikazuje VARIANTE odgovorov, ne vnosov vzorčnega podjetja iz 10. poglavja. Tam stranka vnese točnih 22 € (zato se rezultat prikaže kot ena številka in ne kot pas) in 4.000 € stroškov reklamacij. Odgovor »Ne vem« je tu le prikaz pravila iz 3.3: če bi ga stranka res izbrala, bi neposredni stroški padli s 16.000 € na 12.000 €, področje kakovosti z 19.280 € na 15.280 €, zanesljivost pa bi bila »srednja« tudi ob izbranem glavnem vzroku pri Zalogah.</w:t>
             </w:r>
           </w:p>
         </w:tc>
@@ -16997,7 +16997,7 @@
                 <w:sz w:val="19"/>
                 <w:szCs w:val="19"/>
               </w:rPr>
-              <w:t xml:space="preserve">Planiranje in kapacitete</w:t>
+              <w:t xml:space="preserve">Plan, kapacitete in navodila</w:t>
             </w:r>
           </w:p>
         </w:tc>
@@ -17060,7 +17060,7 @@
                 <w:sz w:val="19"/>
                 <w:szCs w:val="19"/>
               </w:rPr>
-              <w:t xml:space="preserve">Material, izmet in kakovost</w:t>
+              <w:t xml:space="preserve">Izmet, dodelave in kakovost</w:t>
             </w:r>
           </w:p>
         </w:tc>
@@ -17123,7 +17123,7 @@
                 <w:sz w:val="19"/>
                 <w:szCs w:val="19"/>
               </w:rPr>
-              <w:t xml:space="preserve">Zaloge in razpoložljivost</w:t>
+              <w:t xml:space="preserve">Zaloge in razpoložljivost materiala</w:t>
             </w:r>
           </w:p>
         </w:tc>
@@ -19045,7 +19045,7 @@
                 <w:sz w:val="19"/>
                 <w:szCs w:val="19"/>
               </w:rPr>
-              <w:t xml:space="preserve">Ponovno planiranje, priprava poročil, prepisovanje podatkov, usklajevanje dokumentov.</w:t>
+              <w:t xml:space="preserve">Ponovno planiranje, priprava poročil, prepisovanje podatkov, usklajevanje dokumentov. Izjema: v računovodskem servisu se po operativni (računovodski) uri vrednoti skoraj vse referentovo delo — vnos in prepisovanje listin, skeniranje in arhiviranje, lovljenje listin, nadure ob obračunih, ročna priprava obračunov in poročil, popravljanje knjižb in usklajevanje kontov ter neobračunano opravljeno delo. Po administrativni uri se vrednotita le odgovarjanje na ponavljajoča se vprašanja strank in dodatne kontrole pred oddajo.</w:t>
             </w:r>
           </w:p>
         </w:tc>
@@ -19990,7 +19990,7 @@
                 <w:sz w:val="21"/>
                 <w:szCs w:val="21"/>
               </w:rPr>
-              <w:t xml:space="preserve">1.000.000 € × 2 % izgubljene prodaje =  20.000 €</w:t>
+              <w:t xml:space="preserve">1.000.000 € × 3,5 % povpraševanja ob prazni polici  =  35.000 €</w:t>
             </w:r>
           </w:p>
           <w:p>
@@ -20007,7 +20007,7 @@
                 <w:sz w:val="21"/>
                 <w:szCs w:val="21"/>
               </w:rPr>
-              <w:t xml:space="preserve">20.000 € × 25 % marže                =  5.000 €</w:t>
+              <w:t xml:space="preserve">35.000 € × 31 % marže (maloprodajni privzetek)     =  10.850 €</w:t>
             </w:r>
           </w:p>
           <w:p>
@@ -20024,7 +20024,7 @@
                 <w:sz w:val="21"/>
                 <w:szCs w:val="21"/>
               </w:rPr>
-              <w:t xml:space="preserve">5.000 € × (1 − 40 % nadomeščenih)    =  3.000 € nezaslužene marže</w:t>
+              <w:t xml:space="preserve">10.850 € × (1 − 50 % nadomeščenih)                 =   5.425 € nezaslužene marže</w:t>
             </w:r>
           </w:p>
         </w:tc>
@@ -20288,7 +20288,7 @@
                 <w:sz w:val="21"/>
                 <w:szCs w:val="21"/>
               </w:rPr>
-              <w:t xml:space="preserve">(2.000.000 € ÷ 365) × 10 dni prekoračitve × 6 %  =  3.288 €</w:t>
+              <w:t xml:space="preserve">(2.000.000 € ÷ 365) × 10 dni prekoračitve × 8,5 %  =  4.658 €</w:t>
             </w:r>
           </w:p>
         </w:tc>
@@ -20643,7 +20643,7 @@
                 <w:sz w:val="19"/>
                 <w:szCs w:val="19"/>
               </w:rPr>
-              <w:t xml:space="preserve">Letni strošek financiranja</w:t>
+              <w:t xml:space="preserve">Letni strošek financiranja (samo maloprodaja)</w:t>
             </w:r>
           </w:p>
         </w:tc>
@@ -20672,7 +20672,7 @@
                 <w:sz w:val="19"/>
                 <w:szCs w:val="19"/>
               </w:rPr>
-              <w:t xml:space="preserve">50.000 € presežne zaloge × 6 %</w:t>
+              <w:t xml:space="preserve">15.000 € sprostljive zaloge × 8,5 %</w:t>
             </w:r>
           </w:p>
         </w:tc>
@@ -20701,7 +20701,7 @@
                 <w:sz w:val="19"/>
                 <w:szCs w:val="19"/>
               </w:rPr>
-              <w:t xml:space="preserve">3.000 €</w:t>
+              <w:t xml:space="preserve">1.275 €</w:t>
             </w:r>
           </w:p>
         </w:tc>
@@ -20763,7 +20763,7 @@
           <w:sz w:val="21"/>
           <w:szCs w:val="21"/>
         </w:rPr>
-        <w:t xml:space="preserve">Kapital predstavlja denar, ki bi ga bilo mogoče sprostiti. Strošek kapitala predstavlja letno ceno tega, da denar ostaja vezan. To sta dva različna podatka.</w:t>
+        <w:t xml:space="preserve">Kapital predstavlja denar, ki bi ga bilo mogoče sprostiti. Strošek kapitala predstavlja letno ceno tega, da denar ostaja vezan. To sta dva različna podatka — obe postavki pa stojita na ISTI osnovi: na sprostljivem znesku. Ločenega vnosa »presežne zaloge« ni. Letni strošek financiranja nastane SAMO v maloprodajnem vprašalniku (glej 7.7): proizvodni modul zalog vrne le odpise, čakanje na material in sprostljiv kapital, zato te postavke v vzorčnem primeru ni in skupni letni učinek ostane 31.100 €.</w:t>
       </w:r>
     </w:p>
     <w:p>
@@ -23656,7 +23656,7 @@
           <w:sz w:val="21"/>
           <w:szCs w:val="21"/>
         </w:rPr>
-        <w:t xml:space="preserve">Če bi aplikacija seštela vse izračunane zneske brez razlikovanja, bi za naš vzorčni primer dobila 36.780 €. Takšna številka pa ne bi bila pravilna kot skupna letna izguba, ker meša letne in enkratne učinke.</w:t>
+        <w:t xml:space="preserve">Če bi aplikacija seštela vse izračunane zneske brez razlikovanja, bi za naš vzorčni primer dobila 46.100 €. Takšna številka pa ne bi bila pravilna kot skupna letna izguba, ker meša letne in enkratne učinke.</w:t>
       </w:r>
     </w:p>
     <w:p>
@@ -23715,7 +23715,7 @@
                 <w:sz w:val="21"/>
                 <w:szCs w:val="21"/>
               </w:rPr>
-              <w:t xml:space="preserve">Napačno:  10.000 + 4.000 + 5.280 + 2.500 + 15.000  =  36.780 €</w:t>
+              <w:t xml:space="preserve">Napačno:  10.000 + 4.000 + 2.000 + 2.500 + 5.280 + 2.640 + 4.680 + 15.000  =  46.100 €</w:t>
             </w:r>
           </w:p>
           <w:p>
@@ -23749,7 +23749,7 @@
                 <w:sz w:val="21"/>
                 <w:szCs w:val="21"/>
               </w:rPr>
-              <w:t xml:space="preserve">Pravilno:  letni učinek       =  21.780 € letno</w:t>
+              <w:t xml:space="preserve">Pravilno:  letni učinek       =  31.100 € letno</w:t>
             </w:r>
           </w:p>
           <w:p>
@@ -26250,7 +26250,7 @@
                 <w:sz w:val="19"/>
                 <w:szCs w:val="19"/>
               </w:rPr>
-              <w:t xml:space="preserve">Načrtovanje in kapacitete</w:t>
+              <w:t xml:space="preserve">Plan, kapacitete in navodila</w:t>
             </w:r>
           </w:p>
         </w:tc>
@@ -26434,7 +26434,7 @@
                 <w:sz w:val="19"/>
                 <w:szCs w:val="19"/>
               </w:rPr>
-              <w:t xml:space="preserve">Zaloge</w:t>
+              <w:t xml:space="preserve">Zaloge in razpoložljivost materiala</w:t>
             </w:r>
           </w:p>
         </w:tc>
@@ -26982,7 +26982,7 @@
           <w:sz w:val="25"/>
           <w:szCs w:val="25"/>
         </w:rPr>
-        <w:t xml:space="preserve">6.9  Znana posebnost splošnega vprašalnika</w:t>
+        <w:t xml:space="preserve">6.9  Enotna razvrstitev v vseh panogah</w:t>
       </w:r>
       <w:bookmarkEnd w:id="146"/>
     </w:p>
@@ -27053,7 +27053,7 @@
                 <w:sz w:val="21"/>
                 <w:szCs w:val="21"/>
               </w:rPr>
-              <w:t xml:space="preserve">Pri večini panog se postavka »izgubljena prispevna marža« pravilno uvrsti med nezasluženo maržo. V splošnem segmentu pa je ena takšna postavka trenutno uvrščena med neposredne stroške.</w:t>
+              <w:t xml:space="preserve">Postavka »izgubljena prispevna marža« se v VSEH panogah uvrsti med nezasluženo maržo — tudi v splošnem vprašalniku. Prejšnja različica tega dokumenta je navajala, da je v splošnem segmentu uvrščena med neposredne stroške; ta izjema je bila avgusta 2026 odpravljena.</w:t>
             </w:r>
           </w:p>
           <w:p>
@@ -27079,7 +27079,7 @@
                 <w:sz w:val="21"/>
                 <w:szCs w:val="21"/>
               </w:rPr>
-              <w:t xml:space="preserve">Skupni letni znesek ostane pravilen — težava je v razvrstitvi med kategorijami, ne v vsoti.</w:t>
+              <w:t xml:space="preserve">Če ste dokument brali prej ali ste za to izjemo slišali: ne velja več. Razvrstitev je enotna.</w:t>
             </w:r>
           </w:p>
         </w:tc>
@@ -27782,7 +27782,7 @@
                 <w:sz w:val="19"/>
                 <w:szCs w:val="19"/>
               </w:rPr>
-              <w:t xml:space="preserve">Ljudje, odgovornosti, disciplina</w:t>
+              <w:t xml:space="preserve">Ljudje: usposobljenost, disciplina, kader</w:t>
             </w:r>
           </w:p>
         </w:tc>
@@ -27961,7 +27961,7 @@
                 <w:sz w:val="19"/>
                 <w:szCs w:val="19"/>
               </w:rPr>
-              <w:t xml:space="preserve">30 %</w:t>
+              <w:t xml:space="preserve">45 %</w:t>
             </w:r>
           </w:p>
         </w:tc>
@@ -27990,7 +27990,7 @@
                 <w:sz w:val="19"/>
                 <w:szCs w:val="19"/>
               </w:rPr>
-              <w:t xml:space="preserve">Uporabi se previdnejša privzeta ocena.</w:t>
+              <w:t xml:space="preserve">Previdna privzeta ocena — 25. percentil porazdelitve vseh vzrokov, ki jih vprašalnik ponuja (ne meritev pri strankah). Enaka kot pri kategoriji »Ljudje«.</w:t>
             </w:r>
           </w:p>
         </w:tc>
@@ -28082,7 +28082,7 @@
                 <w:sz w:val="19"/>
                 <w:szCs w:val="19"/>
               </w:rPr>
-              <w:t xml:space="preserve">25 %</w:t>
+              <w:t xml:space="preserve">30 %</w:t>
             </w:r>
           </w:p>
         </w:tc>
@@ -28539,7 +28539,7 @@
                 <w:sz w:val="19"/>
                 <w:szCs w:val="19"/>
               </w:rPr>
-              <w:t xml:space="preserve">Neažuren proizvodni plan, ni pregleda nad kapacitetami, material ni naročen pravočasno, usklajevanje po telefonu in e-pošti.</w:t>
+              <w:t xml:space="preserve">Neažuren proizvodni plan, ni pregleda nad kapacitetami, material ni naročen pravočasno, usklajevanje po telefonu in e-pošti, nejasne odgovornosti.</w:t>
             </w:r>
           </w:p>
         </w:tc>
@@ -28631,7 +28631,7 @@
                 <w:sz w:val="19"/>
                 <w:szCs w:val="19"/>
               </w:rPr>
-              <w:t xml:space="preserve">Zaposleni ne vnašajo podatkov pravočasno, postopki niso dogovorjeni, nejasne odgovornosti med oddelki.</w:t>
+              <w:t xml:space="preserve">Pomanjkanje usposabljanja, menjava ljudi, napake pri izvedbi, premalo kadra. POZOR: »podatki se ne vnašajo sproti« je v aplikaciji uvrščeno med Podatke (75 %), »nejasne odgovornosti« pa med Načrtovanje (65 %) — sem sodi le tisto, kar bi ostalo tudi ob urejenem sistemu.</w:t>
             </w:r>
           </w:p>
         </w:tc>
@@ -28694,7 +28694,7 @@
                 <w:sz w:val="19"/>
                 <w:szCs w:val="19"/>
               </w:rPr>
-              <w:t xml:space="preserve">Neznan vzrok — 30 %</w:t>
+              <w:t xml:space="preserve">Neznan vzrok — 45 %</w:t>
             </w:r>
           </w:p>
         </w:tc>
@@ -28786,7 +28786,7 @@
                 <w:sz w:val="19"/>
                 <w:szCs w:val="19"/>
               </w:rPr>
-              <w:t xml:space="preserve">Zunanji dejavniki — 25 %</w:t>
+              <w:t xml:space="preserve">Zunanji dejavniki — 30 %</w:t>
             </w:r>
           </w:p>
         </w:tc>
@@ -29562,7 +29562,7 @@
                 <w:sz w:val="19"/>
                 <w:szCs w:val="19"/>
               </w:rPr>
-              <w:t xml:space="preserve">30 %</w:t>
+              <w:t xml:space="preserve">45 %</w:t>
             </w:r>
           </w:p>
         </w:tc>
@@ -29591,7 +29591,7 @@
                 <w:sz w:val="19"/>
                 <w:szCs w:val="19"/>
               </w:rPr>
-              <w:t xml:space="preserve">3.000 €</w:t>
+              <w:t xml:space="preserve">4.500 €</w:t>
             </w:r>
           </w:p>
         </w:tc>
@@ -29620,7 +29620,7 @@
                 <w:sz w:val="19"/>
                 <w:szCs w:val="19"/>
               </w:rPr>
-              <w:t xml:space="preserve">7.000 €</w:t>
+              <w:t xml:space="preserve">5.500 €</w:t>
             </w:r>
           </w:p>
         </w:tc>
@@ -29683,7 +29683,7 @@
                 <w:sz w:val="19"/>
                 <w:szCs w:val="19"/>
               </w:rPr>
-              <w:t xml:space="preserve">25 %</w:t>
+              <w:t xml:space="preserve">30 %</w:t>
             </w:r>
           </w:p>
         </w:tc>
@@ -29712,7 +29712,7 @@
                 <w:sz w:val="19"/>
                 <w:szCs w:val="19"/>
               </w:rPr>
-              <w:t xml:space="preserve">2.500 €</w:t>
+              <w:t xml:space="preserve">3.000 €</w:t>
             </w:r>
           </w:p>
         </w:tc>
@@ -29741,7 +29741,7 @@
                 <w:sz w:val="19"/>
                 <w:szCs w:val="19"/>
               </w:rPr>
-              <w:t xml:space="preserve">7.500 €</w:t>
+              <w:t xml:space="preserve">7.000 €</w:t>
             </w:r>
           </w:p>
         </w:tc>
@@ -29931,7 +29931,7 @@
           <w:sz w:val="21"/>
           <w:szCs w:val="21"/>
         </w:rPr>
-        <w:t xml:space="preserve">Aplikacija ne uporablja enega samega deleža za celotno podjetje. Vzrok se določa pri vsakem poslovnem področju posebej, kar je natančneje.</w:t>
+        <w:t xml:space="preserve">Aplikacija ne uporablja enega samega deleža za celotno podjetje. Vzrok se določa pri vsakem poslovnem področju posebej, kar je natančneje. Pri postavkah s fizikalnim dnom velja še zgornja meja: izmet materiala je omejen na 50 %, zato področje kakovosti ne dobi celotnih 75 %.</w:t>
       </w:r>
     </w:p>
     <w:p>
@@ -30144,7 +30144,7 @@
                 <w:sz w:val="19"/>
                 <w:szCs w:val="19"/>
               </w:rPr>
-              <w:t xml:space="preserve">Kakovost in dodelave</w:t>
+              <w:t xml:space="preserve">Izmet, dodelave in kakovost</w:t>
             </w:r>
           </w:p>
         </w:tc>
@@ -30231,7 +30231,7 @@
                 <w:sz w:val="19"/>
                 <w:szCs w:val="19"/>
               </w:rPr>
-              <w:t xml:space="preserve">75 %</w:t>
+              <w:t xml:space="preserve">75 % (izmet: 50 %)</w:t>
             </w:r>
           </w:p>
         </w:tc>
@@ -30260,7 +30260,7 @@
                 <w:sz w:val="19"/>
                 <w:szCs w:val="19"/>
               </w:rPr>
-              <w:t xml:space="preserve">14.460 €</w:t>
+              <w:t xml:space="preserve">11.960 €</w:t>
             </w:r>
           </w:p>
         </w:tc>
@@ -30294,7 +30294,7 @@
                 <w:sz w:val="19"/>
                 <w:szCs w:val="19"/>
               </w:rPr>
-              <w:t xml:space="preserve">Načrtovanje in kapacitete</w:t>
+              <w:t xml:space="preserve">Plan, kapacitete in navodila</w:t>
             </w:r>
           </w:p>
         </w:tc>
@@ -30444,7 +30444,7 @@
                 <w:sz w:val="19"/>
                 <w:szCs w:val="19"/>
               </w:rPr>
-              <w:t xml:space="preserve">Roki in zamude</w:t>
+              <w:t xml:space="preserve">Roki in nujni stroški</w:t>
             </w:r>
           </w:p>
         </w:tc>
@@ -30531,7 +30531,7 @@
                 <w:sz w:val="19"/>
                 <w:szCs w:val="19"/>
               </w:rPr>
-              <w:t xml:space="preserve">25 %</w:t>
+              <w:t xml:space="preserve">30 %</w:t>
             </w:r>
           </w:p>
         </w:tc>
@@ -30560,7 +30560,7 @@
                 <w:sz w:val="19"/>
                 <w:szCs w:val="19"/>
               </w:rPr>
-              <w:t xml:space="preserve">1.125 €</w:t>
+              <w:t xml:space="preserve">1.350 €</w:t>
             </w:r>
           </w:p>
         </w:tc>
@@ -30710,7 +30710,7 @@
                 <w:sz w:val="19"/>
                 <w:szCs w:val="19"/>
               </w:rPr>
-              <w:t xml:space="preserve">20.343 €</w:t>
+              <w:t xml:space="preserve">18.068 €</w:t>
             </w:r>
           </w:p>
         </w:tc>
@@ -30929,7 +30929,7 @@
                 <w:sz w:val="19"/>
                 <w:szCs w:val="19"/>
               </w:rPr>
-              <w:t xml:space="preserve">20.343 € letno</w:t>
+              <w:t xml:space="preserve">18.068 € letno</w:t>
             </w:r>
           </w:p>
         </w:tc>
@@ -31047,7 +31047,7 @@
                 <w:sz w:val="21"/>
                 <w:szCs w:val="21"/>
               </w:rPr>
-              <w:t xml:space="preserve">»Po uporabi naslovljivosti podjetje izgublja samo še 20.343 €.«</w:t>
+              <w:t xml:space="preserve">»Po uporabi naslovljivosti podjetje izgublja samo še 18.068 €.«</w:t>
             </w:r>
           </w:p>
           <w:p>
@@ -31089,7 +31089,7 @@
                 <w:sz w:val="21"/>
                 <w:szCs w:val="21"/>
               </w:rPr>
-              <w:t xml:space="preserve">»Podjetje ima 31.100 € izmerjenih letnih učinkov, od tega je 20.343 € ocenjenih kot naslovljivih z izboljšanjem podatkov, procesov in poslovnega sistema.«</w:t>
+              <w:t xml:space="preserve">»Podjetje ima 31.100 € izmerjenih letnih učinkov, od tega je 18.068 € ocenjenih kot naslovljivih z izboljšanjem podatkov, procesov in poslovnega sistema.«</w:t>
             </w:r>
           </w:p>
         </w:tc>
@@ -31191,6 +31191,40 @@
           <w:szCs w:val="21"/>
         </w:rPr>
         <w:t xml:space="preserve"> Naslovljivost je mogoče uporabiti samo na postavki, ki ima izračunano vrednost v evrih. »Visoko tveganje × 75 %« ni izračun.</w:t>
+      </w:r>
+    </w:p>
+    <w:p>
+      <w:pPr>
+        <w:pStyle w:val="ListParagraph"/>
+        <w:numPr>
+          <w:ilvl w:val="0"/>
+          <w:numId w:val="2"/>
+        </w:numPr>
+        <w:spacing w:after="70" w:line="276"/>
+      </w:pPr>
+      <w:r>
+        <w:rPr>
+          <w:b/>
+          <w:bCs/>
+          <w:i w:val="false"/>
+          <w:iCs w:val="false"/>
+          <w:color w:val="262626"/>
+          <w:sz w:val="21"/>
+          <w:szCs w:val="21"/>
+        </w:rPr>
+        <w:t xml:space="preserve">Strošek financiranja presežne zaloge.</w:t>
+      </w:r>
+      <w:r>
+        <w:rPr>
+          <w:b w:val="false"/>
+          <w:bCs w:val="false"/>
+          <w:i w:val="false"/>
+          <w:iCs w:val="false"/>
+          <w:color w:val="262626"/>
+          <w:sz w:val="21"/>
+          <w:szCs w:val="21"/>
+        </w:rPr>
+        <w:t xml:space="preserve"> Ta letna postavka (maloprodaja) se šteje v skupni letni učinek, naslovljivega deleža pa nima — stoji na isti osnovi kot sprostljivi kapital in bi bila sicer šteta dvakrat.</w:t>
       </w:r>
     </w:p>
     <w:p>
@@ -31449,7 +31483,7 @@
                 <w:sz w:val="21"/>
                 <w:szCs w:val="21"/>
               </w:rPr>
-              <w:t xml:space="preserve">Deleži 75 %, 65 %, 45 %, 30 %, 25 % in 15 % so vnaprej določene metodološke ocene, ne empirično potrjene vrednosti iz meritev pri strankah.</w:t>
+              <w:t xml:space="preserve">Deleži 75 %, 65 %, 45 % (ljudje in neznan vzrok), 30 % in 15 % so vnaprej določene metodološke ocene, umerjene proti literaturi — ne empirično potrjene vrednosti iz meritev pri strankah.</w:t>
             </w:r>
           </w:p>
           <w:p>
@@ -31555,7 +31589,7 @@
           <w:sz w:val="34"/>
           <w:szCs w:val="34"/>
         </w:rPr>
-        <w:t xml:space="preserve">8.  Korak 7: Pas izboljšave</w:t>
+        <w:t xml:space="preserve">8.  Korak 7: Naslovljivi potencial</w:t>
       </w:r>
       <w:bookmarkEnd w:id="157"/>
     </w:p>
@@ -31614,7 +31648,7 @@
                 <w:sz w:val="21"/>
                 <w:szCs w:val="21"/>
               </w:rPr>
-              <w:t xml:space="preserve">Aplikacija glede na trenutni način vodenja poslovanja določi odstotni razpon in z njim izračuna, kolikšen del naslovljive izgube bi bilo mogoče realno zmanjšati.</w:t>
+              <w:t xml:space="preserve">Aplikacija sešteje naslovljive dele vseh letnih postavk in tako dobi znesek, na katerega lahko boljši poslovni sistem sploh vpliva.</w:t>
             </w:r>
           </w:p>
         </w:tc>
@@ -31724,7 +31758,7 @@
                 <w:sz w:val="21"/>
                 <w:szCs w:val="21"/>
               </w:rPr>
-              <w:t xml:space="preserve">Realistični potencial = naslovljiva izguba × pas izboljšave</w:t>
+              <w:t xml:space="preserve">Naslovljivi potencial = Σ (letna postavka × naslovljivi delež)</w:t>
             </w:r>
           </w:p>
           <w:p>
@@ -31758,7 +31792,7 @@
                 <w:sz w:val="21"/>
                 <w:szCs w:val="21"/>
               </w:rPr>
-              <w:t xml:space="preserve">7.500 € × 25 %  =  1.875 €   (spodnja meja)</w:t>
+              <w:t xml:space="preserve">10.000 € × 75 %  =  7.500 € letno</w:t>
             </w:r>
           </w:p>
           <w:p>
@@ -31775,7 +31809,7 @@
                 <w:sz w:val="21"/>
                 <w:szCs w:val="21"/>
               </w:rPr>
-              <w:t xml:space="preserve">7.500 € × 40 %  =  3.000 €   (zgornja meja)</w:t>
+              <w:t xml:space="preserve">En sam koeficient — drugega množitelja ni.</w:t>
             </w:r>
           </w:p>
         </w:tc>
@@ -31807,7 +31841,7 @@
           <w:sz w:val="25"/>
           <w:szCs w:val="25"/>
         </w:rPr>
-        <w:t xml:space="preserve">8.2  Pasovi glede na trenutni sistem</w:t>
+        <w:t xml:space="preserve">8.2  Vrzel sedanjega sistema: signal, ne množitelj</w:t>
       </w:r>
       <w:bookmarkEnd w:id="159"/>
     </w:p>
@@ -31826,7 +31860,7 @@
           <w:sz w:val="21"/>
           <w:szCs w:val="21"/>
         </w:rPr>
-        <w:t xml:space="preserve">Pas se določi na podlagi odgovora na vprašanje »Kako danes vodite poslovanje?«</w:t>
+        <w:t xml:space="preserve">Vprašanje »Kako danes vodite poslovanje?« se še vedno postavi, vendar od avgusta 2026 ne vstopa v izračun evrov. Spodnji odstotki napajajo kvalifikacijo (ocena ICP) in prodajno pripravo.</w:t>
       </w:r>
     </w:p>
     <w:p>
@@ -32613,7 +32647,7 @@
           <w:sz w:val="21"/>
           <w:szCs w:val="21"/>
         </w:rPr>
-        <w:t xml:space="preserve">Če stranka sistema ne navede, aplikacija uporabi privzeti pas 15–30 %. Splošni vprašalnik ima nižje pasove, ker manj natančno zajame posebnosti konkretne dejavnosti.</w:t>
+        <w:t xml:space="preserve">Če stranka sistema ne navede, se uporabi privzeta vrzel 15–30 %. Ti odstotki povedo, kolikšen prostor za izboljšavo ima podjetje glede na svoje izhodišče — prikazanega zneska pa ne zmanjšujejo.</w:t>
       </w:r>
     </w:p>
     <w:p>
@@ -32683,7 +32717,7 @@
                 <w:sz w:val="21"/>
                 <w:szCs w:val="21"/>
               </w:rPr>
-              <w:t xml:space="preserve">Kombinacija ERP + Excel + papir in pretežno ročno poslovanje imata trenutno enak pas (25–40 %). Aplikacija med njima ne razlikuje z ločenimi odstotki, čeprav v praksi nista vedno enaki situaciji. Gre za zavestno metodološko poenostavitev.</w:t>
+              <w:t xml:space="preserve">Do avgusta 2026 se je naslovljiva osnova množila še s to vrzeljo. Ker naslovljivi delež in vrzel merita isto stvar — koliko problema je sploh odpravljivega — je bil isti problem zmanjšan dvakrat: od 10.000 € izgube je bilo prikazanih 1.875 € namesto 7.500 €. Dvojni diskont je odpravljen.</w:t>
             </w:r>
           </w:p>
         </w:tc>
@@ -32715,7 +32749,7 @@
           <w:sz w:val="25"/>
           <w:szCs w:val="25"/>
         </w:rPr>
-        <w:t xml:space="preserve">8.3  Pas se uporabi na naslovljivem delu, ne na celotni izgubi</w:t>
+        <w:t xml:space="preserve">8.3  Zgornja meja pri fizikalnem dnu</w:t>
       </w:r>
       <w:bookmarkEnd w:id="160"/>
     </w:p>
@@ -32869,7 +32903,7 @@
                 <w:sz w:val="19"/>
                 <w:szCs w:val="19"/>
               </w:rPr>
-              <w:t xml:space="preserve">Naslovljivost</w:t>
+              <w:t xml:space="preserve">Naslovljivi delež</w:t>
             </w:r>
           </w:p>
         </w:tc>
@@ -32961,7 +32995,7 @@
                 <w:sz w:val="19"/>
                 <w:szCs w:val="19"/>
               </w:rPr>
-              <w:t xml:space="preserve">Pas izboljšave</w:t>
+              <w:t xml:space="preserve">Zgornja meja</w:t>
             </w:r>
           </w:p>
         </w:tc>
@@ -32990,7 +33024,7 @@
                 <w:sz w:val="19"/>
                 <w:szCs w:val="19"/>
               </w:rPr>
-              <w:t xml:space="preserve">Kolikšen del naslovljive težave je mogoče realno zmanjšati?</w:t>
+              <w:t xml:space="preserve">Ali ima postavka fizikalno dno, ki ga noben sistem ne odpravi?</w:t>
             </w:r>
           </w:p>
         </w:tc>
@@ -33019,7 +33053,7 @@
                 <w:sz w:val="19"/>
                 <w:szCs w:val="19"/>
               </w:rPr>
-              <w:t xml:space="preserve">25–40 %</w:t>
+              <w:t xml:space="preserve">50 %</w:t>
             </w:r>
           </w:p>
         </w:tc>
@@ -33081,7 +33115,7 @@
                 <w:sz w:val="21"/>
                 <w:szCs w:val="21"/>
               </w:rPr>
-              <w:t xml:space="preserve">Pravilno:   10.000 € × 75 % = 7.500 €  →  7.500 € × 25–40 % = 1.875–3.000 €</w:t>
+              <w:t xml:space="preserve">Pravilno:   10.000 € × 75 % = 7.500 €        izmet: × min(75 %, 50 %) = 5.000 €</w:t>
             </w:r>
           </w:p>
           <w:p>
@@ -33115,7 +33149,7 @@
                 <w:sz w:val="21"/>
                 <w:szCs w:val="21"/>
               </w:rPr>
-              <w:t xml:space="preserve">Napačno:    10.000 € × 25–40 % = 2.500–4.000 €</w:t>
+              <w:t xml:space="preserve">Napačno:    10.000 € × 75 % × 25–40 % = 1.875–3.000 €   (dvojni diskont)</w:t>
             </w:r>
           </w:p>
         </w:tc>
@@ -33147,7 +33181,7 @@
           <w:sz w:val="25"/>
           <w:szCs w:val="25"/>
         </w:rPr>
-        <w:t xml:space="preserve">8.4  Kombinirani učinek obeh odstotkov</w:t>
+        <w:t xml:space="preserve">8.4  Naslovljivi potencial po vzrokih</w:t>
       </w:r>
       <w:bookmarkEnd w:id="161"/>
     </w:p>
@@ -33166,7 +33200,7 @@
           <w:sz w:val="21"/>
           <w:szCs w:val="21"/>
         </w:rPr>
-        <w:t xml:space="preserve">Odstotka se množita. Pri naslovljivosti 75 % in pasu 25–40 % aplikacija oceni izboljšanje v višini 18,75–30 % prvotnega letnega učinka.</w:t>
+        <w:t xml:space="preserve">Naslovljivi delež je edini koeficient, ki zmanjša izmerjeni strošek. Pri isti izgubi da vsak glavni vzrok svoj potencial.</w:t>
       </w:r>
     </w:p>
     <w:p>
@@ -33196,7 +33230,7 @@
           <w:sz w:val="21"/>
           <w:szCs w:val="21"/>
         </w:rPr>
-        <w:t xml:space="preserve">Spodaj: enaka letna izguba 10.000 € in enak sistem (Excel in papir, 25–40 %), različni vzroki.</w:t>
+        <w:t xml:space="preserve">Spodaj: enaka letna izguba 10.000 €, različni glavni vzroki.</w:t>
       </w:r>
     </w:p>
     <w:p>
@@ -33287,7 +33321,7 @@
                 <w:sz w:val="19"/>
                 <w:szCs w:val="19"/>
               </w:rPr>
-              <w:t xml:space="preserve">Naslovljivost</w:t>
+              <w:t xml:space="preserve">Naslovljivi delež</w:t>
             </w:r>
           </w:p>
         </w:tc>
@@ -33316,7 +33350,7 @@
                 <w:sz w:val="19"/>
                 <w:szCs w:val="19"/>
               </w:rPr>
-              <w:t xml:space="preserve">Pas izboljšave</w:t>
+              <w:t xml:space="preserve">Letna izguba</w:t>
             </w:r>
           </w:p>
         </w:tc>
@@ -33345,7 +33379,7 @@
                 <w:sz w:val="19"/>
                 <w:szCs w:val="19"/>
               </w:rPr>
-              <w:t xml:space="preserve">Končni potencial</w:t>
+              <w:t xml:space="preserve">Naslovljivi potencial</w:t>
             </w:r>
           </w:p>
         </w:tc>
@@ -33437,7 +33471,7 @@
                 <w:sz w:val="19"/>
                 <w:szCs w:val="19"/>
               </w:rPr>
-              <w:t xml:space="preserve">25–40 %</w:t>
+              <w:t xml:space="preserve">10.000 €</w:t>
             </w:r>
           </w:p>
         </w:tc>
@@ -33466,7 +33500,7 @@
                 <w:sz w:val="19"/>
                 <w:szCs w:val="19"/>
               </w:rPr>
-              <w:t xml:space="preserve">1.875–3.000 €</w:t>
+              <w:t xml:space="preserve">7.500 €</w:t>
             </w:r>
           </w:p>
         </w:tc>
@@ -33558,7 +33592,7 @@
                 <w:sz w:val="19"/>
                 <w:szCs w:val="19"/>
               </w:rPr>
-              <w:t xml:space="preserve">25–40 %</w:t>
+              <w:t xml:space="preserve">10.000 €</w:t>
             </w:r>
           </w:p>
         </w:tc>
@@ -33587,7 +33621,7 @@
                 <w:sz w:val="19"/>
                 <w:szCs w:val="19"/>
               </w:rPr>
-              <w:t xml:space="preserve">1.625–2.600 €</w:t>
+              <w:t xml:space="preserve">6.500 €</w:t>
             </w:r>
           </w:p>
         </w:tc>
@@ -33621,7 +33655,7 @@
                 <w:sz w:val="19"/>
                 <w:szCs w:val="19"/>
               </w:rPr>
-              <w:t xml:space="preserve">Ljudje in odgovornosti</w:t>
+              <w:t xml:space="preserve">Ljudje in organizacijska disciplina</w:t>
             </w:r>
           </w:p>
         </w:tc>
@@ -33679,7 +33713,7 @@
                 <w:sz w:val="19"/>
                 <w:szCs w:val="19"/>
               </w:rPr>
-              <w:t xml:space="preserve">25–40 %</w:t>
+              <w:t xml:space="preserve">10.000 €</w:t>
             </w:r>
           </w:p>
         </w:tc>
@@ -33708,7 +33742,7 @@
                 <w:sz w:val="19"/>
                 <w:szCs w:val="19"/>
               </w:rPr>
-              <w:t xml:space="preserve">1.125–1.800 €</w:t>
+              <w:t xml:space="preserve">4.500 €</w:t>
             </w:r>
           </w:p>
         </w:tc>
@@ -33771,7 +33805,7 @@
                 <w:sz w:val="19"/>
                 <w:szCs w:val="19"/>
               </w:rPr>
-              <w:t xml:space="preserve">30 %</w:t>
+              <w:t xml:space="preserve">45 %</w:t>
             </w:r>
           </w:p>
         </w:tc>
@@ -33800,7 +33834,7 @@
                 <w:sz w:val="19"/>
                 <w:szCs w:val="19"/>
               </w:rPr>
-              <w:t xml:space="preserve">25–40 %</w:t>
+              <w:t xml:space="preserve">10.000 €</w:t>
             </w:r>
           </w:p>
         </w:tc>
@@ -33829,7 +33863,7 @@
                 <w:sz w:val="19"/>
                 <w:szCs w:val="19"/>
               </w:rPr>
-              <w:t xml:space="preserve">750–1.200 €</w:t>
+              <w:t xml:space="preserve">4.500 €</w:t>
             </w:r>
           </w:p>
         </w:tc>
@@ -33892,7 +33926,7 @@
                 <w:sz w:val="19"/>
                 <w:szCs w:val="19"/>
               </w:rPr>
-              <w:t xml:space="preserve">25 %</w:t>
+              <w:t xml:space="preserve">30 %</w:t>
             </w:r>
           </w:p>
         </w:tc>
@@ -33921,7 +33955,7 @@
                 <w:sz w:val="19"/>
                 <w:szCs w:val="19"/>
               </w:rPr>
-              <w:t xml:space="preserve">25–40 %</w:t>
+              <w:t xml:space="preserve">10.000 €</w:t>
             </w:r>
           </w:p>
         </w:tc>
@@ -33950,7 +33984,7 @@
                 <w:sz w:val="19"/>
                 <w:szCs w:val="19"/>
               </w:rPr>
-              <w:t xml:space="preserve">625–1.000 €</w:t>
+              <w:t xml:space="preserve">3.000 €</w:t>
             </w:r>
           </w:p>
         </w:tc>
@@ -34042,7 +34076,7 @@
                 <w:sz w:val="19"/>
                 <w:szCs w:val="19"/>
               </w:rPr>
-              <w:t xml:space="preserve">25–40 %</w:t>
+              <w:t xml:space="preserve">10.000 €</w:t>
             </w:r>
           </w:p>
         </w:tc>
@@ -34071,7 +34105,7 @@
                 <w:sz w:val="19"/>
                 <w:szCs w:val="19"/>
               </w:rPr>
-              <w:t xml:space="preserve">375–600 €</w:t>
+              <w:t xml:space="preserve">1.500 €</w:t>
             </w:r>
           </w:p>
         </w:tc>
@@ -34103,7 +34137,7 @@
           <w:sz w:val="25"/>
           <w:szCs w:val="25"/>
         </w:rPr>
-        <w:t xml:space="preserve">8.5  Ista naslovljiva izguba, različni sistemi</w:t>
+        <w:t xml:space="preserve">8.5  Večletni pogled in cena odlašanja</w:t>
       </w:r>
       <w:bookmarkEnd w:id="162"/>
     </w:p>
@@ -34122,7 +34156,7 @@
           <w:sz w:val="21"/>
           <w:szCs w:val="21"/>
         </w:rPr>
-        <w:t xml:space="preserve">Naslovljiva izguba 20.343 € letno, spreminja se samo trenutni sistem.</w:t>
+        <w:t xml:space="preserve">Ker se o poslovnem sistemu odloča na tri- do petletnem obzorju, aplikacija pokaže tudi trileten seštevek in ceno odlašanja. POZOR — pogosta napaka: oboje se računa iz SKUPNEGA LETNEGA UČINKA (31.100 €), ne iz naslovljivega potenciala (18.068 €). Iz potenciala izhaja samo tabela povračila v PDF-ju.</w:t>
       </w:r>
     </w:p>
     <w:p>
@@ -34184,7 +34218,7 @@
                 <w:sz w:val="19"/>
                 <w:szCs w:val="19"/>
               </w:rPr>
-              <w:t xml:space="preserve">Trenutni sistem</w:t>
+              <w:t xml:space="preserve">Pogled</w:t>
             </w:r>
           </w:p>
         </w:tc>
@@ -34213,7 +34247,7 @@
                 <w:sz w:val="19"/>
                 <w:szCs w:val="19"/>
               </w:rPr>
-              <w:t xml:space="preserve">Pas</w:t>
+              <w:t xml:space="preserve">Izračun</w:t>
             </w:r>
           </w:p>
         </w:tc>
@@ -34242,7 +34276,7 @@
                 <w:sz w:val="19"/>
                 <w:szCs w:val="19"/>
               </w:rPr>
-              <w:t xml:space="preserve">Spodnja meja</w:t>
+              <w:t xml:space="preserve">Vrednost</w:t>
             </w:r>
           </w:p>
         </w:tc>
@@ -34271,7 +34305,7 @@
                 <w:sz w:val="19"/>
                 <w:szCs w:val="19"/>
               </w:rPr>
-              <w:t xml:space="preserve">Zgornja meja</w:t>
+              <w:t xml:space="preserve">Opomba</w:t>
             </w:r>
           </w:p>
         </w:tc>
@@ -34305,7 +34339,7 @@
                 <w:sz w:val="19"/>
                 <w:szCs w:val="19"/>
               </w:rPr>
-              <w:t xml:space="preserve">PANTHEON z ustreznim modulom</w:t>
+              <w:t xml:space="preserve">Letno</w:t>
             </w:r>
           </w:p>
         </w:tc>
@@ -34334,7 +34368,7 @@
                 <w:sz w:val="19"/>
                 <w:szCs w:val="19"/>
               </w:rPr>
-              <w:t xml:space="preserve">8–20 %</w:t>
+              <w:t xml:space="preserve">—</w:t>
             </w:r>
           </w:p>
         </w:tc>
@@ -34363,7 +34397,7 @@
                 <w:sz w:val="19"/>
                 <w:szCs w:val="19"/>
               </w:rPr>
-              <w:t xml:space="preserve">1.627 €</w:t>
+              <w:t xml:space="preserve">31.100 €</w:t>
             </w:r>
           </w:p>
         </w:tc>
@@ -34392,7 +34426,7 @@
                 <w:sz w:val="19"/>
                 <w:szCs w:val="19"/>
               </w:rPr>
-              <w:t xml:space="preserve">4.069 €</w:t>
+              <w:t xml:space="preserve">Osnova večletnega pogleda — skupni letni učinek.</w:t>
             </w:r>
           </w:p>
         </w:tc>
@@ -34426,7 +34460,7 @@
                 <w:sz w:val="19"/>
                 <w:szCs w:val="19"/>
               </w:rPr>
-              <w:t xml:space="preserve">PANTHEON brez ustreznega modula</w:t>
+              <w:t xml:space="preserve">V treh letih</w:t>
             </w:r>
           </w:p>
         </w:tc>
@@ -34455,7 +34489,7 @@
                 <w:sz w:val="19"/>
                 <w:szCs w:val="19"/>
               </w:rPr>
-              <w:t xml:space="preserve">15–30 %</w:t>
+              <w:t xml:space="preserve">31.100 € × 3</w:t>
             </w:r>
           </w:p>
         </w:tc>
@@ -34484,7 +34518,7 @@
                 <w:sz w:val="19"/>
                 <w:szCs w:val="19"/>
               </w:rPr>
-              <w:t xml:space="preserve">3.051 €</w:t>
+              <w:t xml:space="preserve">93.300 €</w:t>
             </w:r>
           </w:p>
         </w:tc>
@@ -34513,7 +34547,7 @@
                 <w:sz w:val="19"/>
                 <w:szCs w:val="19"/>
               </w:rPr>
-              <w:t xml:space="preserve">6.103 €</w:t>
+              <w:t xml:space="preserve">Brez rasti, inflacije in diskontiranja.</w:t>
             </w:r>
           </w:p>
         </w:tc>
@@ -34547,7 +34581,7 @@
                 <w:sz w:val="19"/>
                 <w:szCs w:val="19"/>
               </w:rPr>
-              <w:t xml:space="preserve">Drug poslovni sistem</w:t>
+              <w:t xml:space="preserve">Na delovni dan</w:t>
             </w:r>
           </w:p>
         </w:tc>
@@ -34576,7 +34610,7 @@
                 <w:sz w:val="19"/>
                 <w:szCs w:val="19"/>
               </w:rPr>
-              <w:t xml:space="preserve">15–30 %</w:t>
+              <w:t xml:space="preserve">31.100 € ÷ 252</w:t>
             </w:r>
           </w:p>
         </w:tc>
@@ -34605,7 +34639,7 @@
                 <w:sz w:val="19"/>
                 <w:szCs w:val="19"/>
               </w:rPr>
-              <w:t xml:space="preserve">3.051 €</w:t>
+              <w:t xml:space="preserve">123 €</w:t>
             </w:r>
           </w:p>
         </w:tc>
@@ -34634,7 +34668,7 @@
                 <w:sz w:val="19"/>
                 <w:szCs w:val="19"/>
               </w:rPr>
-              <w:t xml:space="preserve">6.103 €</w:t>
+              <w:t xml:space="preserve">Cena vsakega delovnega dne brez odločitve.</w:t>
             </w:r>
           </w:p>
         </w:tc>
@@ -34668,7 +34702,7 @@
                 <w:sz w:val="19"/>
                 <w:szCs w:val="19"/>
               </w:rPr>
-              <w:t xml:space="preserve">Kombinacija ERP, Excela in papirja</w:t>
+              <w:t xml:space="preserve">Na mesec</w:t>
             </w:r>
           </w:p>
         </w:tc>
@@ -34697,7 +34731,7 @@
                 <w:sz w:val="19"/>
                 <w:szCs w:val="19"/>
               </w:rPr>
-              <w:t xml:space="preserve">25–40 %</w:t>
+              <w:t xml:space="preserve">31.100 € ÷ 12</w:t>
             </w:r>
           </w:p>
         </w:tc>
@@ -34726,7 +34760,7 @@
                 <w:sz w:val="19"/>
                 <w:szCs w:val="19"/>
               </w:rPr>
-              <w:t xml:space="preserve">5.086 €</w:t>
+              <w:t xml:space="preserve">2.592 €</w:t>
             </w:r>
           </w:p>
         </w:tc>
@@ -34755,7 +34789,7 @@
                 <w:sz w:val="19"/>
                 <w:szCs w:val="19"/>
               </w:rPr>
-              <w:t xml:space="preserve">8.137 €</w:t>
+              <w:t xml:space="preserve">Cena vsakega meseca odlašanja.</w:t>
             </w:r>
           </w:p>
         </w:tc>
@@ -34789,7 +34823,7 @@
                 <w:sz w:val="19"/>
                 <w:szCs w:val="19"/>
               </w:rPr>
-              <w:t xml:space="preserve">Večinoma Excel, papir in telefon</w:t>
+              <w:t xml:space="preserve">Doba povračila</w:t>
             </w:r>
           </w:p>
         </w:tc>
@@ -34818,7 +34852,7 @@
                 <w:sz w:val="19"/>
                 <w:szCs w:val="19"/>
               </w:rPr>
-              <w:t xml:space="preserve">25–40 %</w:t>
+              <w:t xml:space="preserve">60.000 € ÷ 18.068 € × 12</w:t>
             </w:r>
           </w:p>
         </w:tc>
@@ -34847,7 +34881,7 @@
                 <w:sz w:val="19"/>
                 <w:szCs w:val="19"/>
               </w:rPr>
-              <w:t xml:space="preserve">5.086 €</w:t>
+              <w:t xml:space="preserve">40 mesecev</w:t>
             </w:r>
           </w:p>
         </w:tc>
@@ -34876,7 +34910,7 @@
                 <w:sz w:val="19"/>
                 <w:szCs w:val="19"/>
               </w:rPr>
-              <w:t xml:space="preserve">8.137 €</w:t>
+              <w:t xml:space="preserve">Ena od treh stopenj (30.000, 60.000, 120.000 €). Edina postavka, ki izhaja iz naslovljivega potenciala; prikaže se le pri potencialu vsaj 10.000 € letno.</w:t>
             </w:r>
           </w:p>
         </w:tc>
@@ -34966,7 +35000,7 @@
                 <w:sz w:val="17"/>
                 <w:szCs w:val="17"/>
               </w:rPr>
-              <w:t xml:space="preserve">EN PAS ZA PODJETJE, RAZLIČNA NASLOVLJIVOST PO PODROČJIH</w:t>
+              <w:t xml:space="preserve">NASLOVLJIVOST SE RAZLIKUJE PO PODROČJIH, POTENCIAL JE NJIHOVA VSOTA</w:t>
             </w:r>
           </w:p>
           <w:p>
@@ -34983,7 +35017,7 @@
                 <w:sz w:val="21"/>
                 <w:szCs w:val="21"/>
               </w:rPr>
-              <w:t xml:space="preserve">Naslovljivost se razlikuje po področjih</w:t>
+              <w:t xml:space="preserve">Vsako področje ima svoj glavni vzrok in s tem svoj naslovljivi delež.</w:t>
             </w:r>
             <w:r>
               <w:rPr>
@@ -34995,7 +35029,7 @@
                 <w:sz w:val="21"/>
                 <w:szCs w:val="21"/>
               </w:rPr>
-              <w:t xml:space="preserve"> (vsako področje ima svoj glavni vzrok).</w:t>
+              <w:t xml:space="preserve"/>
             </w:r>
           </w:p>
           <w:p>
@@ -35012,7 +35046,7 @@
                 <w:sz w:val="21"/>
                 <w:szCs w:val="21"/>
               </w:rPr>
-              <w:t xml:space="preserve">Pas izboljšave je za celotno podjetje en sam</w:t>
+              <w:t xml:space="preserve">Nekatere postavke imajo zgornjo mejo</w:t>
             </w:r>
             <w:r>
               <w:rPr>
@@ -35024,7 +35058,7 @@
                 <w:sz w:val="21"/>
                 <w:szCs w:val="21"/>
               </w:rPr>
-              <w:t xml:space="preserve"> (izhaja iz enega odgovora o trenutnem sistemu).</w:t>
+              <w:t xml:space="preserve"> — izmet materiala in prazni kilometri imajo fizikalno dno (50 %), ki ga noben sistem ne odpravi.</w:t>
             </w:r>
           </w:p>
           <w:p>
@@ -35050,7 +35084,7 @@
                 <w:sz w:val="21"/>
                 <w:szCs w:val="21"/>
               </w:rPr>
-              <w:t xml:space="preserve">Zaporedje izračuna je zato: vsako področje dobi svoj naslovljivi delež → naslovljivi deli se seštejejo → skupna naslovljiva osnova se pomnoži s skupnim pasom.</w:t>
+              <w:t xml:space="preserve">Zaporedje izračuna je zato: vsako področje dobi svoj naslovljivi delež (po potrebi omejen z zgornjo mejo) → naslovljivi deli se seštejejo → vsota je končni naslovljivi potencial.</w:t>
             </w:r>
           </w:p>
         </w:tc>
@@ -35082,7 +35116,7 @@
           <w:sz w:val="25"/>
           <w:szCs w:val="25"/>
         </w:rPr>
-        <w:t xml:space="preserve">8.7  Česa pas izboljšave ni</w:t>
+        <w:t xml:space="preserve">8.7  Česa naslovljivi potencial ni</w:t>
       </w:r>
       <w:bookmarkEnd w:id="164"/>
     </w:p>
@@ -35332,7 +35366,7 @@
                 <w:sz w:val="19"/>
                 <w:szCs w:val="19"/>
               </w:rPr>
-              <w:t xml:space="preserve">Statistični interval zaupanja</w:t>
+              <w:t xml:space="preserve">Napoved prihranka</w:t>
             </w:r>
           </w:p>
         </w:tc>
@@ -35361,7 +35395,7 @@
                 <w:sz w:val="19"/>
                 <w:szCs w:val="19"/>
               </w:rPr>
-              <w:t xml:space="preserve">Gre za vnaprej določeno metodološko predpostavko, ne za empirično napovedno območje.</w:t>
+              <w:t xml:space="preserve">Gre za vnaprej določeno metodološko predpostavko o odpravljivosti, ne za empirično napoved.</w:t>
             </w:r>
           </w:p>
         </w:tc>
@@ -35424,7 +35458,7 @@
                 <w:sz w:val="19"/>
                 <w:szCs w:val="19"/>
               </w:rPr>
-              <w:t xml:space="preserve">Razpon 20–25 € na uro izraža negotovost glede stroška dela. Pas 25–40 % izraža ocenjeni delež zmanjšanja naslovljivih učinkov.</w:t>
+              <w:t xml:space="preserve">Razpon 20–25 € na uro izraža negotovost glede stroška dela. Naslovljivi delež pove, kolikšen del težave je sploh odpravljiv — to sta različni vrsti negotovosti.</w:t>
             </w:r>
           </w:p>
         </w:tc>
@@ -35546,7 +35580,7 @@
                 <w:sz w:val="21"/>
                 <w:szCs w:val="21"/>
               </w:rPr>
-              <w:t xml:space="preserve">Tega izračuna aplikacija ne opravi, ker ne pozna dejanske investicije.</w:t>
+              <w:t xml:space="preserve">Aplikacija takšen izračun opravi za tri predpostavljene stopnje investicije (30.000, 60.000 in 120.000 €) in ga v strankinem PDF-ju izriše kot tabelo povračila — a samo, kadar je naslovljivi potencial vsaj 10.000 € letno. V zgornjem primeru z 8.000 € potenciala tabele torej ni. Cene, ponujene konkretni stranki, aplikacija ne pozna, zato pravega ROI ne izračuna.</w:t>
             </w:r>
           </w:p>
         </w:tc>
@@ -35597,7 +35631,7 @@
           <w:sz w:val="21"/>
           <w:szCs w:val="21"/>
         </w:rPr>
-        <w:t xml:space="preserve">Pas se uporabi samo za področja, za katera je mogoče izračunati letni učinek. Če področje zaradi manjkajočih podatkov prispeva 0 €, je tudi njegov potencial 0 € × naslovljivost × pas = 0 €.</w:t>
+        <w:t xml:space="preserve">Naslovljivi delež se uporabi samo za področja, za katera je mogoče izračunati letni učinek. Če področje zaradi manjkajočih podatkov prispeva 0 €, je tudi njegov potencial 0 € × naslovljivost = 0 €.</w:t>
       </w:r>
     </w:p>
     <w:p>
@@ -36229,7 +36263,7 @@
                 <w:sz w:val="19"/>
                 <w:szCs w:val="19"/>
               </w:rPr>
-              <w:t xml:space="preserve">Realistični potencial izboljšave</w:t>
+              <w:t xml:space="preserve">Naslovljivi potencial</w:t>
             </w:r>
           </w:p>
         </w:tc>
@@ -36258,7 +36292,7 @@
                 <w:sz w:val="19"/>
                 <w:szCs w:val="19"/>
               </w:rPr>
-              <w:t xml:space="preserve">Ocenjeni razpon zmanjšanja naslovljivih učinkov.</w:t>
+              <w:t xml:space="preserve">Del izmerjenih letnih učinkov, na katerega lahko poslovni sistem vpliva.</w:t>
             </w:r>
           </w:p>
         </w:tc>
@@ -36579,6 +36613,24 @@
         </w:tc>
       </w:tr>
     </w:tbl>
+    <w:p>
+      <w:pPr>
+        <w:spacing w:after="140" w:before="0" w:line="276"/>
+        <w:jc w:val="left"/>
+      </w:pPr>
+      <w:r>
+        <w:rPr>
+          <w:b w:val="false"/>
+          <w:bCs w:val="false"/>
+          <w:i w:val="false"/>
+          <w:iCs w:val="false"/>
+          <w:color w:val="262626"/>
+          <w:sz w:val="21"/>
+          <w:szCs w:val="21"/>
+        </w:rPr>
+        <w:t xml:space="preserve">Poleg naštetega poročilo pokaže še tri izpeljanke, ki v tej tabeli niso navedene: znesek »v treh letih«, ceno odlašanja na delovni dan in na mesec (oboje na zaslonu in v PDF-ju, izpeljano iz skupnega letnega učinka) ter tabelo povračila (samo v PDF-ju, izpeljano iz naslovljivega potenciala).</w:t>
+      </w:r>
+    </w:p>
     <w:p>
       <w:pPr>
         <w:spacing w:after="240"/>
@@ -38035,7 +38087,7 @@
                 <w:sz w:val="19"/>
                 <w:szCs w:val="19"/>
               </w:rPr>
-              <w:t xml:space="preserve">Skupne finančne predpostavke niso zgolj ocenjene, ni odgovorov »Ne vem«, izpolnjenega je najmanj približno 80 % relevantnega tehtanega dela vprašanj.</w:t>
+              <w:t xml:space="preserve">NOBENA vprašana skupna finančna predpostavka ni ocenjena, ni odgovorov »Ne vem« in ni neodgovorjenih izbirnih vprašanj (npr. neizbran glavni vzrok), izpolnjenega je najmanj približno 80 % relevantnega tehtanega dela vprašanj.</w:t>
             </w:r>
           </w:p>
         </w:tc>
@@ -38127,7 +38179,7 @@
                 <w:sz w:val="19"/>
                 <w:szCs w:val="19"/>
               </w:rPr>
-              <w:t xml:space="preserve">Del podatkov je ocenjen — izbrani razponi, panožna povprečja, nekateri stroški niso povsem znani.</w:t>
+              <w:t xml:space="preserve">Vse, kar ni ne visoka ne nizka: del podatkov je ocenjen (izbrani razponi, panožna povprečja) ALI je kje ostal odgovor »Ne vem« oziroma neodgovorjeno izbirno vprašanje (npr. neizbran glavni vzrok) — tudi če ni ocenjena nobena finančna predpostavka — izpolnjenega pa je več kot približno 50 % relevantnega tehtanega dela vprašanj.</w:t>
             </w:r>
           </w:p>
         </w:tc>
@@ -38219,7 +38271,7 @@
                 <w:sz w:val="19"/>
                 <w:szCs w:val="19"/>
               </w:rPr>
-              <w:t xml:space="preserve">Manjka velik del odgovorov, predpostavke so pretežno ocenjene, pogosti odgovori »Ne vem«, ali manjka prihodek, ki ga formula potrebuje. Izpolnjenega je največ približno 50 %.</w:t>
+              <w:t xml:space="preserve">Izpolnjenega je največ približno 50 % relevantnega tehtanega dela vprašanj, ali pa so ocenjene VSE vprašane predpostavke, ali manjka prihodek, ki ga izpolnjeno področje potrebuje. Delna ocenjenost (npr. dve postavki od treh) sama po sebi da »srednjo«, ne »nizke«.</w:t>
             </w:r>
           </w:p>
         </w:tc>
@@ -39421,7 +39473,7 @@
                 <w:sz w:val="19"/>
                 <w:szCs w:val="19"/>
               </w:rPr>
-              <w:t xml:space="preserve">Vedno — ob vsakem rezultatu.</w:t>
+              <w:t xml:space="preserve">Kadar je izmerjenih področij manj od ponujenih. Podjetje, ki izpolni vsa, te vrstice ne vidi.</w:t>
             </w:r>
           </w:p>
         </w:tc>
@@ -39668,7 +39720,7 @@
                 <w:sz w:val="19"/>
                 <w:szCs w:val="19"/>
               </w:rPr>
-              <w:t xml:space="preserve">Razpon (npr. 30.740–31.460 €)</w:t>
+              <w:t xml:space="preserve">Razpon (npr. 30.380–32.180 €)</w:t>
             </w:r>
           </w:p>
         </w:tc>
@@ -39726,7 +39778,7 @@
                 <w:sz w:val="19"/>
                 <w:szCs w:val="19"/>
               </w:rPr>
-              <w:t xml:space="preserve">Končni znesek se spreminja glede na dejansko vrednost vhodnega podatka. To ni isto kot pas izboljšave.</w:t>
+              <w:t xml:space="preserve">Končni znesek se spreminja glede na dejansko vrednost vhodnega podatka. To ni isto kot naslovljivi delež.</w:t>
             </w:r>
           </w:p>
         </w:tc>
@@ -39777,7 +39829,7 @@
           <w:sz w:val="21"/>
           <w:szCs w:val="21"/>
         </w:rPr>
-        <w:t xml:space="preserve">Večina ključnih elementov je prisotna na obeh mestih. Razlikujeta se dva:</w:t>
+        <w:t xml:space="preserve">Večina ključnih elementov je prisotna na obeh mestih. Razlikujejo se trije:</w:t>
       </w:r>
     </w:p>
     <w:p>
@@ -40390,7 +40442,7 @@
                 <w:sz w:val="19"/>
                 <w:szCs w:val="19"/>
               </w:rPr>
-              <w:t xml:space="preserve">Podrobna formula s številkami stranke (»Prikaži izračun«)</w:t>
+              <w:t xml:space="preserve">Formula s konkretnimi številkami stranke (»Prikaži izračun«)</w:t>
             </w:r>
           </w:p>
         </w:tc>
@@ -40675,7 +40727,7 @@
                 <w:sz w:val="21"/>
                 <w:szCs w:val="21"/>
               </w:rPr>
-              <w:t xml:space="preserve">To je močno orodje za gradnjo zaupanja — stranka vidi točno, katere podatke je aplikacija uporabila in kako je nastal znesek. V PDF-ju te razčlenitve ni, zato je smiselno ključne izračune pokazati že med pogovorom.</w:t>
+              <w:t xml:space="preserve">To je močno orodje za gradnjo zaupanja — stranka vidi točno, katere podatke je aplikacija uporabila in kako je nastal znesek. PDF ima razdelek »Kako smo računali« s formulo za vsako področje, nima pa strankinih konkretnih številk ob njej — zato je smiselno ključne izračune pokazati že med pogovorom.</w:t>
             </w:r>
           </w:p>
         </w:tc>
@@ -40708,7 +40760,7 @@
           <w:sz w:val="21"/>
           <w:szCs w:val="21"/>
         </w:rPr>
-        <w:t xml:space="preserve">PDF pa vsebuje predlagane naslednje ukrepe — konkretne usmeritve, kaj naj podjetje naredi najprej (na primer: pregledati vzroke izmeta in reklamacij, uskladiti podatke med prodajo, nabavo in proizvodnjo, preveriti vodenje proizvodnega plana). To ni finančni izračun, ampak interpretacija zaznanih težav.</w:t>
+        <w:t xml:space="preserve">PDF pa vsebuje predlagane naslednje ukrepe — konkretne usmeritve, kaj naj podjetje naredi najprej (na primer: pregledati vzroke izmeta in reklamacij, uskladiti podatke med prodajo, nabavo in proizvodnjo, preveriti vodenje proizvodnega plana). To ni finančni izračun, ampak interpretacija zaznanih težav. Poleg tega ima PDF še tabelo povračila (»Pri kateri investiciji se to povrne«), ki je na zaslonu ni.</w:t>
       </w:r>
     </w:p>
     <w:p>
@@ -44248,7 +44300,7 @@
                 <w:sz w:val="19"/>
                 <w:szCs w:val="19"/>
               </w:rPr>
-              <w:t xml:space="preserve">Kakovost in dodelave</w:t>
+              <w:t xml:space="preserve">Izmet, dodelave in kakovost</w:t>
             </w:r>
           </w:p>
         </w:tc>
@@ -44335,7 +44387,7 @@
                 <w:sz w:val="19"/>
                 <w:szCs w:val="19"/>
               </w:rPr>
-              <w:t xml:space="preserve">75 %</w:t>
+              <w:t xml:space="preserve">75 % (izmet: 50 %)</w:t>
             </w:r>
           </w:p>
         </w:tc>
@@ -44364,7 +44416,7 @@
                 <w:sz w:val="19"/>
                 <w:szCs w:val="19"/>
               </w:rPr>
-              <w:t xml:space="preserve">14.460 €</w:t>
+              <w:t xml:space="preserve">11.960 €</w:t>
             </w:r>
           </w:p>
         </w:tc>
@@ -44398,7 +44450,7 @@
                 <w:sz w:val="19"/>
                 <w:szCs w:val="19"/>
               </w:rPr>
-              <w:t xml:space="preserve">Načrtovanje in kapacitete</w:t>
+              <w:t xml:space="preserve">Plan, kapacitete in navodila</w:t>
             </w:r>
           </w:p>
         </w:tc>
@@ -44548,7 +44600,7 @@
                 <w:sz w:val="19"/>
                 <w:szCs w:val="19"/>
               </w:rPr>
-              <w:t xml:space="preserve">Roki in zamude</w:t>
+              <w:t xml:space="preserve">Roki in nujni stroški</w:t>
             </w:r>
           </w:p>
         </w:tc>
@@ -44635,7 +44687,7 @@
                 <w:sz w:val="19"/>
                 <w:szCs w:val="19"/>
               </w:rPr>
-              <w:t xml:space="preserve">25 %</w:t>
+              <w:t xml:space="preserve">30 %</w:t>
             </w:r>
           </w:p>
         </w:tc>
@@ -44664,7 +44716,7 @@
                 <w:sz w:val="19"/>
                 <w:szCs w:val="19"/>
               </w:rPr>
-              <w:t xml:space="preserve">1.125 €</w:t>
+              <w:t xml:space="preserve">1.350 €</w:t>
             </w:r>
           </w:p>
         </w:tc>
@@ -44814,7 +44866,7 @@
                 <w:sz w:val="19"/>
                 <w:szCs w:val="19"/>
               </w:rPr>
-              <w:t xml:space="preserve">20.343 €</w:t>
+              <w:t xml:space="preserve">18.068 €</w:t>
             </w:r>
           </w:p>
         </w:tc>
@@ -44846,7 +44898,7 @@
           <w:sz w:val="25"/>
           <w:szCs w:val="25"/>
         </w:rPr>
-        <w:t xml:space="preserve">10.5  Korak 7: pas izboljšave</w:t>
+        <w:t xml:space="preserve">10.5  Korak 7: naslovljivi potencial</w:t>
       </w:r>
       <w:bookmarkEnd w:id="179"/>
     </w:p>
@@ -44865,7 +44917,7 @@
           <w:sz w:val="21"/>
           <w:szCs w:val="21"/>
         </w:rPr>
-        <w:t xml:space="preserve">Podjetje posluje s kombinacijo Excela, papirja in poslovnega programa → pas 25–40 %.</w:t>
+        <w:t xml:space="preserve">Odgovor o sedanjem sistemu (kombinacija Excela, papirja in poslovnega programa) se zabeleži za kvalifikacijo, v izračun evrov pa ne vstopa.</w:t>
       </w:r>
     </w:p>
     <w:p>
@@ -44924,7 +44976,7 @@
                 <w:sz w:val="21"/>
                 <w:szCs w:val="21"/>
               </w:rPr>
-              <w:t xml:space="preserve">20.343 € × 25 %  =  5.085,75 €</w:t>
+              <w:t xml:space="preserve">Naslovljivi potencial  =  18.068 € letno</w:t>
             </w:r>
           </w:p>
           <w:p>
@@ -44941,7 +44993,7 @@
                 <w:sz w:val="21"/>
                 <w:szCs w:val="21"/>
               </w:rPr>
-              <w:t xml:space="preserve">20.343 € × 40 %  =  8.137,20 €</w:t>
+              <w:t xml:space="preserve">V treh letih:  31.100 € × 3  =  93.300 €   (iz skupnega letnega učinka, ne iz potenciala)</w:t>
             </w:r>
           </w:p>
         </w:tc>
@@ -45679,7 +45731,7 @@
                 <w:sz w:val="19"/>
                 <w:szCs w:val="19"/>
               </w:rPr>
-              <w:t xml:space="preserve">Realistični potencial izboljšave</w:t>
+              <w:t xml:space="preserve">Naslovljivi potencial</w:t>
             </w:r>
           </w:p>
         </w:tc>
@@ -45708,7 +45760,7 @@
                 <w:sz w:val="19"/>
                 <w:szCs w:val="19"/>
               </w:rPr>
-              <w:t xml:space="preserve">5.086–8.137 € letno</w:t>
+              <w:t xml:space="preserve">18.068 € letno</w:t>
             </w:r>
           </w:p>
         </w:tc>
@@ -45737,7 +45789,7 @@
                 <w:sz w:val="19"/>
                 <w:szCs w:val="19"/>
               </w:rPr>
-              <w:t xml:space="preserve">Ocenjeni potencial zmanjšanja naslovljivih učinkov.</w:t>
+              <w:t xml:space="preserve">Del izmerjenih učinkov, na katerega lahko poslovni sistem vpliva.</w:t>
             </w:r>
           </w:p>
         </w:tc>
@@ -45800,7 +45852,7 @@
                 <w:sz w:val="19"/>
                 <w:szCs w:val="19"/>
               </w:rPr>
-              <w:t xml:space="preserve">Visoka</w:t>
+              <w:t xml:space="preserve">Srednja</w:t>
             </w:r>
           </w:p>
         </w:tc>
@@ -45829,7 +45881,7 @@
                 <w:sz w:val="19"/>
                 <w:szCs w:val="19"/>
               </w:rPr>
-              <w:t xml:space="preserve">Ocena kakovosti in popolnosti vhodnih podatkov.</w:t>
+              <w:t xml:space="preserve">Ocena kakovosti in popolnosti vhodnih podatkov. Ni »visoka«, ker pri četrtem izbranem področju (Zaloge) glavni vzrok ni bil izbran.</w:t>
             </w:r>
           </w:p>
         </w:tc>
@@ -46091,7 +46143,7 @@
                 <w:sz w:val="21"/>
                 <w:szCs w:val="21"/>
               </w:rPr>
-              <w:t xml:space="preserve">31.100 €  →  20.343 €  →  5.086–8.137 €      +  ločeno 15.000 € enkratno</w:t>
+              <w:t xml:space="preserve">31.100 € letno  →  naslovljivo 18.068 € letno        |        v treh letih 93.300 € (31.100 × 3)      +  ločeno 15.000 € enkratno</w:t>
             </w:r>
           </w:p>
           <w:p>
@@ -46117,7 +46169,7 @@
                 <w:sz w:val="21"/>
                 <w:szCs w:val="21"/>
               </w:rPr>
-              <w:t xml:space="preserve">Izmerjeni letni učinek → naslovljivi del → realistični potencial izboljšave, ločeno od enkratno sprostljivega kapitala.</w:t>
+              <w:t xml:space="preserve">Izmerjeni letni učinek je izhodišče dveh ločenih izpeljank: naslovljivega potenciala in večletnega pogleda. Enkratno sprostljivi kapital stoji ločeno od obeh.</w:t>
             </w:r>
           </w:p>
         </w:tc>
@@ -46393,7 +46445,7 @@
                 <w:sz w:val="19"/>
                 <w:szCs w:val="19"/>
               </w:rPr>
-              <w:t xml:space="preserve">»31.100 € je izmerjeni učinek pred oceno naslovljivosti. Ocenjeni realistični potencial izboljšave je 5.086–8.137 € letno.«</w:t>
+              <w:t xml:space="preserve">»31.100 € je izmerjeni učinek pred oceno naslovljivosti. Naslovljivi potencial je 18.068 € letno. V poročilu piše tudi ›v treh letih 93.300 €‹ — to je skupni letni učinek čez tri leta, ne potencial.«</w:t>
             </w:r>
           </w:p>
         </w:tc>
@@ -46553,7 +46605,7 @@
                 <w:sz w:val="19"/>
                 <w:szCs w:val="19"/>
               </w:rPr>
-              <w:t xml:space="preserve">»Po naslovljivosti izgubljate samo še 20.343 €.«</w:t>
+              <w:t xml:space="preserve">»Po naslovljivosti izgubljate samo še 18.068 €.«</w:t>
             </w:r>
           </w:p>
         </w:tc>
@@ -46582,7 +46634,7 @@
                 <w:sz w:val="19"/>
                 <w:szCs w:val="19"/>
               </w:rPr>
-              <w:t xml:space="preserve">»Izguba ostaja 31.100 €. 20.343 € je tisti del, ki je povezan z vzroki, na katere lahko poslovni sistem vpliva.«</w:t>
+              <w:t xml:space="preserve">»Izguba ostaja 31.100 €. 18.068 € je tisti del, ki je povezan z vzroki, na katere lahko poslovni sistem vpliva.«</w:t>
             </w:r>
           </w:p>
         </w:tc>
@@ -47224,7 +47276,7 @@
           <w:sz w:val="21"/>
           <w:szCs w:val="21"/>
         </w:rPr>
-        <w:t xml:space="preserve">Ali si ločil skupni učinek, naslovljivo osnovo in potencial izboljšave?</w:t>
+        <w:t xml:space="preserve">Ali si ločil skupni letni učinek, naslovljivi potencial in enkratno sprostljivi kapital? (»Naslovljiva osnova« in »potencial izboljšave« sta ista številka — odkar pasu izboljšave ni več.)</w:t>
       </w:r>
     </w:p>
     <w:p>
@@ -47663,7 +47715,7 @@
                 <w:sz w:val="19"/>
                 <w:szCs w:val="19"/>
               </w:rPr>
-              <w:t xml:space="preserve">»Zaposleni ne vnašajo podatkov pravočasno.«</w:t>
+              <w:t xml:space="preserve">»Ljudje niso dovolj usposobljeni, kader se pogosto menja.«</w:t>
             </w:r>
           </w:p>
         </w:tc>
@@ -47721,7 +47773,7 @@
                 <w:sz w:val="19"/>
                 <w:szCs w:val="19"/>
               </w:rPr>
-              <w:t xml:space="preserve">Delna: sledljivost in odgovornosti da, organizacijska kultura ne.</w:t>
+              <w:t xml:space="preserve">Delna: sledljivost in opozorila da, usposabljanje in kultura ne. (Če stranka reče, da se podatki ne vnašajo sproti, je to Podatki — 75 %, ne Ljudje.)</w:t>
             </w:r>
           </w:p>
         </w:tc>
@@ -47784,7 +47836,7 @@
                 <w:sz w:val="19"/>
                 <w:szCs w:val="19"/>
               </w:rPr>
-              <w:t xml:space="preserve">30 %</w:t>
+              <w:t xml:space="preserve">45 %</w:t>
             </w:r>
           </w:p>
         </w:tc>
@@ -47876,7 +47928,7 @@
                 <w:sz w:val="19"/>
                 <w:szCs w:val="19"/>
               </w:rPr>
-              <w:t xml:space="preserve">25 %</w:t>
+              <w:t xml:space="preserve">30 %</w:t>
             </w:r>
           </w:p>
         </w:tc>
@@ -49027,7 +49079,7 @@
                 <w:sz w:val="19"/>
                 <w:szCs w:val="19"/>
               </w:rPr>
-              <w:t xml:space="preserve">Naslovljiva osnova</w:t>
+              <w:t xml:space="preserve">Zgornja meja postavke</w:t>
             </w:r>
           </w:p>
         </w:tc>
@@ -49056,7 +49108,7 @@
                 <w:sz w:val="19"/>
                 <w:szCs w:val="19"/>
               </w:rPr>
-              <w:t xml:space="preserve">Vsota naslovljivih delov vseh letnih postavk.</w:t>
+              <w:t xml:space="preserve">Omejitev naslovljivega deleža tam, kjer ima postavka fizikalno dno (izmet, prazni kilometri): uporabi se nižja od obeh vrednosti.</w:t>
             </w:r>
           </w:p>
         </w:tc>
@@ -49090,7 +49142,7 @@
                 <w:sz w:val="19"/>
                 <w:szCs w:val="19"/>
               </w:rPr>
-              <w:t xml:space="preserve">Pas izboljšave</w:t>
+              <w:t xml:space="preserve">Vrzel sedanjega sistema</w:t>
             </w:r>
           </w:p>
         </w:tc>
@@ -49119,7 +49171,7 @@
                 <w:sz w:val="19"/>
                 <w:szCs w:val="19"/>
               </w:rPr>
-              <w:t xml:space="preserve">Odstotni razpon, ki pove, kolikšen del naslovljive izgube bi bilo mogoče realno zmanjšati (8–40 %).</w:t>
+              <w:t xml:space="preserve">Odstotni razpon (8–40 %), ki pove, kolikšen prostor za izboljšavo ima podjetje glede na sedanji sistem. Prodajni signal za kvalifikacijo; v izračun evrov ne vstopa.</w:t>
             </w:r>
           </w:p>
         </w:tc>
@@ -49153,7 +49205,7 @@
                 <w:sz w:val="19"/>
                 <w:szCs w:val="19"/>
               </w:rPr>
-              <w:t xml:space="preserve">Realistični potencial izboljšave</w:t>
+              <w:t xml:space="preserve">Naslovljivi potencial</w:t>
             </w:r>
           </w:p>
         </w:tc>
@@ -49182,7 +49234,7 @@
                 <w:sz w:val="19"/>
                 <w:szCs w:val="19"/>
               </w:rPr>
-              <w:t xml:space="preserve">Naslovljiva osnova × pas izboljšave; končni prikazani razpon.</w:t>
+              <w:t xml:space="preserve">Vsota naslovljivih delov vseh letnih postavk; končni prikazani potencial. Trileten seštevek v poročilu NI izpeljan iz njega, ampak iz skupnega letnega učinka — naslovljivi potencial je osnova tabele povračila v PDF-ju.</w:t>
             </w:r>
           </w:p>
         </w:tc>

</xml_diff>